<commit_message>
Add per-folder READMEs and pipeline guide; remove em dashes; plainer wording
</commit_message>
<xml_diff>
--- a/data/outputs/fmcg_newsletter_20260621.docx
+++ b/data/outputs/fmcg_newsletter_20260621.docx
@@ -27,7 +27,7 @@
         <w:rPr>
           <w:sz w:val="22"/>
         </w:rPr>
-        <w:t>This edition tracks 21 fast-moving consumer goods deals reported over the last 14 days. The lead stories below are ranked by a blend of relevance, source credibility and recency; a longer tail of smaller moves follows.</w:t>
+        <w:t>This edition tracks 21 FMCG deals reported over the last 14 days. Lead stories are ranked by relevance, credibility and recency.</w:t>
       </w:r>
     </w:p>
     <w:p>
@@ -68,7 +68,7 @@
           <w:color w:val="666666"/>
           <w:sz w:val="16"/>
         </w:rPr>
-        <w:t>Source: Bloomberg — credibility 100/100 (Tier 1 — global wire / financial press) • corroborated by 2 other outlet(s)</w:t>
+        <w:t>Source: Bloomberg - credibility 100/100 (Tier 1 - global wire / financial press) • corroborated by 2 other outlet(s)</w:t>
       </w:r>
     </w:p>
     <w:p>
@@ -110,7 +110,7 @@
           <w:color w:val="666666"/>
           <w:sz w:val="16"/>
         </w:rPr>
-        <w:t>Source: CNBC — credibility 99/100 (Tier 1 — global wire / financial press) • corroborated by 1 other outlet(s)</w:t>
+        <w:t>Source: CNBC - credibility 99/100 (Tier 1 - global wire / financial press) • corroborated by 1 other outlet(s)</w:t>
       </w:r>
     </w:p>
     <w:p>
@@ -152,7 +152,7 @@
           <w:color w:val="666666"/>
           <w:sz w:val="16"/>
         </w:rPr>
-        <w:t>Source: Food Dive — credibility 85/100 (Tier 2 — established trade / industry press)</w:t>
+        <w:t>Source: Food Dive - credibility 85/100 (Tier 2 - established trade / industry press)</w:t>
       </w:r>
     </w:p>
     <w:p>
@@ -194,7 +194,7 @@
           <w:color w:val="666666"/>
           <w:sz w:val="16"/>
         </w:rPr>
-        <w:t>Source: Cosmetics Business — credibility 85/100 (Tier 2 — established trade / industry press)</w:t>
+        <w:t>Source: Cosmetics Business - credibility 85/100 (Tier 2 - established trade / industry press)</w:t>
       </w:r>
     </w:p>
     <w:p>
@@ -236,7 +236,7 @@
           <w:color w:val="666666"/>
           <w:sz w:val="16"/>
         </w:rPr>
-        <w:t>Source: CosmeticsDesign — credibility 85/100 (Tier 2 — established trade / industry press)</w:t>
+        <w:t>Source: CosmeticsDesign - credibility 85/100 (Tier 2 - established trade / industry press)</w:t>
       </w:r>
     </w:p>
     <w:p>
@@ -278,7 +278,7 @@
           <w:color w:val="666666"/>
           <w:sz w:val="16"/>
         </w:rPr>
-        <w:t>Source: Reuters — credibility 95/100 (Tier 1 — global wire / financial press)</w:t>
+        <w:t>Source: Reuters - credibility 95/100 (Tier 1 - global wire / financial press)</w:t>
       </w:r>
     </w:p>
     <w:p>
@@ -306,7 +306,7 @@
         <w:rPr>
           <w:sz w:val="20"/>
         </w:rPr>
-        <w:t>Mondelez explores potential acquisition of Hershey, sources say — Bloomberg</w:t>
+        <w:t>Mondelez explores potential acquisition of Hershey, sources say - Bloomberg</w:t>
       </w:r>
     </w:p>
     <w:p>
@@ -317,7 +317,7 @@
         <w:rPr>
           <w:sz w:val="20"/>
         </w:rPr>
-        <w:t>Private equity firm takes majority stake in personal care brand — City A.M.</w:t>
+        <w:t>Private equity firm takes majority stake in personal care brand - City A.M.</w:t>
       </w:r>
     </w:p>
     <w:p>
@@ -328,7 +328,7 @@
         <w:rPr>
           <w:sz w:val="20"/>
         </w:rPr>
-        <w:t>Campbell completes $2.7 billion acquisition of premium sauce maker — Just Food</w:t>
+        <w:t>Campbell completes $2.7 billion acquisition of premium sauce maker - Just Food</w:t>
       </w:r>
     </w:p>
     <w:p>
@@ -339,7 +339,7 @@
         <w:rPr>
           <w:sz w:val="20"/>
         </w:rPr>
-        <w:t>Unilever sets out plans to spin off ice cream business in stock-market listing — Financial Times</w:t>
+        <w:t>Unilever sets out plans to spin off ice cream business in stock-market listing - Financial Times</w:t>
       </w:r>
     </w:p>
     <w:p>
@@ -350,7 +350,7 @@
         <w:rPr>
           <w:sz w:val="20"/>
         </w:rPr>
-        <w:t>Functional beverage start-up raises $75 million Series C led by consumer fund — FoodBev Media</w:t>
+        <w:t>Functional beverage start-up raises $75 million Series C led by consumer fund - FoodBev Media</w:t>
       </w:r>
     </w:p>
     <w:p>
@@ -361,7 +361,7 @@
         <w:rPr>
           <w:sz w:val="20"/>
         </w:rPr>
-        <w:t>Lactalis to buy regional cheese business, expanding dairy footprint — DairyReporter</w:t>
+        <w:t>Lactalis to buy regional cheese business, expanding dairy footprint - DairyReporter</w:t>
       </w:r>
     </w:p>
     <w:p>
@@ -372,7 +372,7 @@
         <w:rPr>
           <w:sz w:val="20"/>
         </w:rPr>
-        <w:t>Brewer agrees to acquire craft beer maker in regional consolidation — Just Drinks</w:t>
+        <w:t>Brewer agrees to acquire craft beer maker in regional consolidation - Just Drinks</w:t>
       </w:r>
     </w:p>
     <w:p>
@@ -383,7 +383,7 @@
         <w:rPr>
           <w:sz w:val="20"/>
         </w:rPr>
-        <w:t>Pet food maker acquired by consumer goods group in $850 million deal — Pet Food Industry</w:t>
+        <w:t>Pet food maker acquired by consumer goods group in $850 million deal - Pet Food Industry</w:t>
       </w:r>
     </w:p>
     <w:p>
@@ -400,7 +400,7 @@
           <w:color w:val="666666"/>
           <w:sz w:val="16"/>
         </w:rPr>
-        <w:t>Ingestion: public RSS/Atom feeds (Google News deal queries + FMCG trade press), filtered to the last 14 days. No paywalled or private sources.</w:t>
+        <w:t>Ingestion: public RSS/Atom feeds (Google News + FMCG trade press), last 14 days.</w:t>
       </w:r>
     </w:p>
     <w:p>
@@ -409,7 +409,7 @@
           <w:color w:val="666666"/>
           <w:sz w:val="16"/>
         </w:rPr>
-        <w:t>De-duplication: exact match on normalised URL/title, then near-duplicate clustering. Each story is fingerprinted by its named entities (companies, brands) and figures plus significant content words; two reports merge when they share at least 2 entities AND their blended overlap (entity + content overlap coefficients) reaches 0.50. The most credible/recent report is kept as the representative. 5 of 30 articles merged this run.</w:t>
+        <w:t>De-duplication: exact URL/title match, then near-dup clustering by entity overlap (threshold 0.5). 5 of 30 articles merged.</w:t>
       </w:r>
     </w:p>
     <w:p>
@@ -418,7 +418,7 @@
           <w:color w:val="666666"/>
           <w:sz w:val="16"/>
         </w:rPr>
-        <w:t>Relevance: an item must show BOTH a deal signal (acquire/merger/stake/funding…) and an FMCG signal (category or named consumer-goods company); title matches weighted x2. Items scoring below 35/100 are dropped from the draft.</w:t>
+        <w:t>Relevance: requires a deal signal AND an FMCG signal (title ×2). Items below 35/100 are dropped.</w:t>
       </w:r>
     </w:p>
     <w:p>
@@ -427,7 +427,7 @@
           <w:color w:val="666666"/>
           <w:sz w:val="16"/>
         </w:rPr>
-        <w:t>Credibility: transparent source-tier allow-list (global wire &gt; trade press &gt; general &gt; press-release wires), plus a corroboration bonus when multiple independent outlets report the same deal, and a penalty for lone press releases. We rate the SOURCE, not each claim.</w:t>
+        <w:t>Credibility: source-tier allow-list + corroboration bonus − lone press-release penalty.</w:t>
       </w:r>
     </w:p>
     <w:p>
@@ -436,7 +436,7 @@
           <w:color w:val="666666"/>
           <w:sz w:val="16"/>
         </w:rPr>
-        <w:t>Ranking: composite of relevance (45%), credibility (30%), recency (15%) and corroboration (10%).</w:t>
+        <w:t>Ranking: relevance 45%, credibility 30%, recency 15%, corroboration 10%.</w:t>
       </w:r>
     </w:p>
     <w:p>
@@ -445,7 +445,7 @@
           <w:color w:val="666666"/>
           <w:sz w:val="16"/>
         </w:rPr>
-        <w:t>Summaries: template-generated from extracted deal facts + the source blurb (no LLM key set).</w:t>
+        <w:t>Summaries: template from extracted deal facts + source blurb (no LLM_API_KEY set).</w:t>
       </w:r>
     </w:p>
     <w:p>
@@ -454,7 +454,7 @@
           <w:color w:val="666666"/>
           <w:sz w:val="16"/>
         </w:rPr>
-        <w:t>Assumptions &amp; limits: deal value/parties are extracted heuristically (regex) and may be incomplete; coverage reflects what public feeds surface; this is decision-support, not advice.</w:t>
+        <w:t>Deal value/parties are regex heuristics and may be incomplete. Decision-support only.</w:t>
       </w:r>
     </w:p>
     <w:sectPr>

</xml_diff>